<commit_message>
Add details to “Server View Model” at NYT
</commit_message>
<xml_diff>
--- a/resume/Logan Moseley Resume.docx
+++ b/resume/Logan Moseley Resume.docx
@@ -152,7 +152,19 @@
         <w:rPr>
           <w:rtl w:val="0"/>
         </w:rPr>
-        <w:t>Senior iOS engineer with 15 years of experience building large-scale apps at Block, Medium, and The New York Times. Led the NYT Crossword app from inception to &gt;1M MAU</w:t>
+        <w:t>Senior iOS engineer with 15 years of experience building large-scale apps at Block, Medium, and The New York Times.</w:t>
+      </w:r>
+      <w:r>
+        <w:rPr>
+          <w:rtl w:val="0"/>
+        </w:rPr>
+        <w:t xml:space="preserve"> </w:t>
+      </w:r>
+      <w:r>
+        <w:rPr>
+          <w:rtl w:val="0"/>
+        </w:rPr>
+        <w:t>Led the NYT Crossword app from inception to &gt;1M MAU</w:t>
       </w:r>
       <w:r>
         <w:rPr>
@@ -898,11 +910,12 @@
         <w:rPr>
           <w:rtl w:val="0"/>
         </w:rPr>
-        <w:t xml:space="preserve">Worked with the backend team to define OpenAPI specs and wrote our Swift code generator for </w:t>
-      </w:r>
-      <w:r>
-        <w:rPr>
-          <w:rtl w:val="0"/>
+        <w:t xml:space="preserve">Started and championed the </w:t>
+      </w:r>
+      <w:r>
+        <w:rPr>
+          <w:rtl w:val="1"/>
+          <w:lang w:val="ar-SA" w:bidi="ar-SA"/>
         </w:rPr>
         <w:t>“</w:t>
       </w:r>
@@ -922,7 +935,92 @@
         <w:rPr>
           <w:rtl w:val="0"/>
         </w:rPr>
-        <w:t>that powered the main tab.</w:t>
+        <w:t xml:space="preserve">framework. Worked with the backend team to define OpenAPI specs, </w:t>
+      </w:r>
+      <w:r>
+        <w:rPr>
+          <w:rtl w:val="0"/>
+        </w:rPr>
+        <w:t xml:space="preserve">then </w:t>
+      </w:r>
+      <w:r>
+        <w:rPr>
+          <w:rtl w:val="0"/>
+        </w:rPr>
+        <w:t xml:space="preserve">wrote the </w:t>
+      </w:r>
+      <w:r>
+        <w:rPr>
+          <w:rtl w:val="0"/>
+        </w:rPr>
+        <w:t>Swift-</w:t>
+      </w:r>
+      <w:r>
+        <w:rPr>
+          <w:rtl w:val="0"/>
+          <w:lang w:val="it-IT"/>
+        </w:rPr>
+        <w:t>code generator</w:t>
+      </w:r>
+      <w:r>
+        <w:rPr>
+          <w:rtl w:val="0"/>
+        </w:rPr>
+        <w:t>, network JSON decoder, and the</w:t>
+      </w:r>
+      <w:r>
+        <w:rPr>
+          <w:rtl w:val="0"/>
+        </w:rPr>
+        <w:t xml:space="preserve"> UIKit interpreter. The </w:t>
+      </w:r>
+      <w:r>
+        <w:rPr>
+          <w:rtl w:val="0"/>
+        </w:rPr>
+        <w:t>server drove the UI of</w:t>
+      </w:r>
+      <w:r>
+        <w:rPr>
+          <w:rtl w:val="0"/>
+        </w:rPr>
+        <w:t xml:space="preserve"> the </w:t>
+      </w:r>
+      <w:r>
+        <w:rPr>
+          <w:rtl w:val="0"/>
+        </w:rPr>
+        <w:t>app</w:t>
+      </w:r>
+      <w:r>
+        <w:rPr>
+          <w:rtl w:val="0"/>
+        </w:rPr>
+        <w:t>’</w:t>
+      </w:r>
+      <w:r>
+        <w:rPr>
+          <w:rtl w:val="0"/>
+        </w:rPr>
+        <w:t xml:space="preserve">s </w:t>
+      </w:r>
+      <w:r>
+        <w:rPr>
+          <w:rtl w:val="0"/>
+        </w:rPr>
+        <w:t>main tab for about seven years, 2017</w:t>
+      </w:r>
+      <w:r>
+        <w:rPr>
+          <w:rtl w:val="0"/>
+        </w:rPr>
+        <w:t>–</w:t>
+      </w:r>
+      <w:r>
+        <w:rPr>
+          <w:rtl w:val="0"/>
+        </w:rPr>
+        <w:t>2024.</w:t>
       </w:r>
     </w:p>
     <w:p>
@@ -1526,7 +1624,7 @@
       <w:bidi w:val="0"/>
       <w:spacing w:before="120" w:after="0" w:line="240" w:lineRule="auto"/>
       <w:ind w:left="0" w:right="0" w:firstLine="0"/>
-      <w:jc w:val="both"/>
+      <w:jc w:val="left"/>
       <w:outlineLvl w:val="9"/>
     </w:pPr>
     <w:rPr>

</xml_diff>